<commit_message>
nmctapp petition-for-writ: regenerate on the model at HEAD; the footnote split is gone, latex still reported (the ¶ token \mbox drops footnote 5; committed latex render kept) (fb-595.54.54)
Co-Authored-By: Claude Opus 5.5 <noreply@anthropic.com>
</commit_message>
<xml_diff>
--- a/courts/tenth-circuit/new-mexico/state/court-of-appeals/petition-for-writ/usage/OUTPUT-petition-for-writ.docx
+++ b/courts/tenth-circuit/new-mexico/state/court-of-appeals/petition-for-writ/usage/OUTPUT-petition-for-writ.docx
@@ -3601,19 +3601,7 @@
         <w:pStyle w:val="BodyText"/>
       </w:pPr>
       <w:r>
-        <w:t xml:space="preserve">1. On December 17, 2021, the Governor signed Senate Bill 1 (SB 1) into law (codified at NMSA 1978, § 1</w:t>
-      </w:r>
-      <w:r>
-        <w:noBreakHyphen/>
-      </w:r>
-      <w:r>
-        <w:t xml:space="preserve">15</w:t>
-      </w:r>
-      <w:r>
-        <w:noBreakHyphen/>
-      </w:r>
-      <w:r>
-        <w:t xml:space="preserve">16 (2021)), establishing new boundaries for New Mexico’s three congressional districts which the Legislature had adopted following a special legislative session devoted primarily to redistricting.</w:t>
+        <w:t xml:space="preserve">1. On December 17, 2021, the Governor signed Senate Bill 1 (SB 1) into law (codified at NMSA 1978, § 1-⁠15-⁠16 (2021)), establishing new boundaries for New Mexico’s three congressional districts which the Legislature had adopted following a special legislative session devoted primarily to redistricting.</w:t>
       </w:r>
     </w:p>
     <w:p>
@@ -3745,19 +3733,7 @@
         <w:noBreakHyphen/>
       </w:r>
       <w:r>
-        <w:t xml:space="preserve">006, 274 P.3d 66, and the guidelines in the New Mexico Redistricting Act, § 1</w:t>
-      </w:r>
-      <w:r>
-        <w:noBreakHyphen/>
-      </w:r>
-      <w:r>
-        <w:t xml:space="preserve">3A</w:t>
-      </w:r>
-      <w:r>
-        <w:noBreakHyphen/>
-      </w:r>
-      <w:r>
-        <w:t xml:space="preserve">1, et. seq. NMSA 1978, giving rise to Plaintiffs equal protection claim Ex. B, ¶ 6.</w:t>
+        <w:t xml:space="preserve">006, 274 P.3d 66, and the guidelines in the New Mexico Redistricting Act, § 1-⁠3A-⁠1, et. seq. NMSA 1978, giving rise to Plaintiffs equal protection claim Ex. B, ¶ 6.</w:t>
       </w:r>
     </w:p>
     <w:p>
@@ -4432,19 +4408,7 @@
         <w:noBreakHyphen/>
       </w:r>
       <w:r>
-        <w:t xml:space="preserve">006, § 34, or by the independent Citizens Redistricting Committee under the Redistricting Act, NMSA 1978, § 1</w:t>
-      </w:r>
-      <w:r>
-        <w:noBreakHyphen/>
-      </w:r>
-      <w:r>
-        <w:t xml:space="preserve">3A</w:t>
-      </w:r>
-      <w:r>
-        <w:noBreakHyphen/>
-      </w:r>
-      <w:r>
-        <w:t xml:space="preserve">7(A), addresses the wrong audience. Ex. B, ¶ 6. The audience is the Legislature, elected by the people of this state: Not the courts, as in</w:t>
+        <w:t xml:space="preserve">006, § 34, or by the independent Citizens Redistricting Committee under the Redistricting Act, NMSA 1978, § 1-⁠3A-⁠7(A), addresses the wrong audience. Ex. B, ¶ 6. The audience is the Legislature, elected by the people of this state: Not the courts, as in</w:t>
       </w:r>
       <w:r>
         <w:t xml:space="preserve"> </w:t>
@@ -6257,19 +6221,7 @@
         <w:t xml:space="preserve"> </w:t>
       </w:r>
       <w:r>
-        <w:t xml:space="preserve">The Redistricting Act directs that “When proposing or adopting district plans, the committee shall not: use, rely upon or reference partisan data [other than required by federal law]:” § 1</w:t>
-      </w:r>
-      <w:r>
-        <w:noBreakHyphen/>
-      </w:r>
-      <w:r>
-        <w:t xml:space="preserve">3A</w:t>
-      </w:r>
-      <w:r>
-        <w:noBreakHyphen/>
-      </w:r>
-      <w:r>
-        <w:t xml:space="preserve">7(C)⁠(1) (emphasis added).</w:t>
+        <w:t xml:space="preserve">The Redistricting Act directs that “When proposing or adopting district plans, the committee shall not: use, rely upon or reference partisan data [other than required by federal law]:” § 1-⁠3A-⁠7(C)⁠(1) (emphasis added).</w:t>
       </w:r>
     </w:p>
   </w:footnote>
@@ -6288,19 +6240,7 @@
         <w:t xml:space="preserve"> </w:t>
       </w:r>
       <w:r>
-        <w:t xml:space="preserve">Defendants-Appellants therefore requested that the district court include the specific finding on the need for interlocutory review as provided in NMSA 1978, § 39</w:t>
-      </w:r>
-      <w:r>
-        <w:noBreakHyphen/>
-      </w:r>
-      <w:r>
-        <w:t xml:space="preserve">3</w:t>
-      </w:r>
-      <w:r>
-        <w:noBreakHyphen/>
-      </w:r>
-      <w:r>
-        <w:t xml:space="preserve">4. The court’s final Order did not include that language, precluding Defendants-Appellants from petitioning this Court for interlocutory appeal.</w:t>
+        <w:t xml:space="preserve">Defendants-Appellants therefore requested that the district court include the specific finding on the need for interlocutory review as provided in NMSA 1978, § 39-⁠3-⁠4. The court’s final Order did not include that language, precluding Defendants-Appellants from petitioning this Court for interlocutory appeal.</w:t>
       </w:r>
     </w:p>
   </w:footnote>
@@ -7286,6 +7226,33 @@
     <w:pPr>
       <w:spacing w:before="0" w:after="0" w:line="322" w:lineRule="exact"/>
       <w:ind w:left="2160" w:hanging="720"/>
+    </w:pPr>
+  </w:style>
+  <w:style w:type="paragraph" w:customStyle="1" w:styleId="XdQuoteList1">
+    <w:name w:val="Xd Quote List 1"/>
+    <w:basedOn w:val="Normal"/>
+    <w:qFormat/>
+    <w:pPr>
+      <w:spacing w:before="0" w:after="0" w:line="322" w:lineRule="exact"/>
+      <w:ind w:left="1440" w:right="720" w:hanging="720"/>
+    </w:pPr>
+  </w:style>
+  <w:style w:type="paragraph" w:customStyle="1" w:styleId="XdQuoteList2">
+    <w:name w:val="Xd Quote List 2"/>
+    <w:basedOn w:val="Normal"/>
+    <w:qFormat/>
+    <w:pPr>
+      <w:spacing w:before="0" w:after="0" w:line="322" w:lineRule="exact"/>
+      <w:ind w:left="2160" w:right="720" w:hanging="720"/>
+    </w:pPr>
+  </w:style>
+  <w:style w:type="paragraph" w:customStyle="1" w:styleId="XdQuoteList3">
+    <w:name w:val="Xd Quote List 3"/>
+    <w:basedOn w:val="Normal"/>
+    <w:qFormat/>
+    <w:pPr>
+      <w:spacing w:before="0" w:after="0" w:line="322" w:lineRule="exact"/>
+      <w:ind w:left="2880" w:right="720" w:hanging="720"/>
     </w:pPr>
   </w:style>
   <w:style w:type="paragraph" w:customStyle="1" w:styleId="XdQuoteOnly">

</xml_diff>